<commit_message>
Update master paper PDF/DOCX and plots with enlarged, high-contrast diagram fonts
</commit_message>
<xml_diff>
--- a/docs/The_Computational_Grounding_of_My_Ontology_Thomas_Riebl.docx
+++ b/docs/The_Computational_Grounding_of_My_Ontology_Thomas_Riebl.docx
@@ -163,7 +163,7 @@
       <w:r>
         <w:drawing>
           <wp:inline>
-            <wp:extent cx="4140200" cy="2235200"/>
+            <wp:extent cx="5334000" cy="2480930"/>
             <wp:effectExtent b="0" l="0" r="0" t="0"/>
             <wp:docPr descr="Diagram 1" title="" id="10" name="Picture"/>
             <a:graphic>
@@ -184,7 +184,7 @@
                   <pic:spPr bwMode="auto">
                     <a:xfrm>
                       <a:off x="0" y="0"/>
-                      <a:ext cx="4140200" cy="2235200"/>
+                      <a:ext cx="5334000" cy="2480930"/>
                     </a:xfrm>
                     <a:prstGeom prst="rect">
                       <a:avLst/>
@@ -656,7 +656,7 @@
       <w:r>
         <w:drawing>
           <wp:inline>
-            <wp:extent cx="4165600" cy="1181100"/>
+            <wp:extent cx="5334000" cy="3461247"/>
             <wp:effectExtent b="0" l="0" r="0" t="0"/>
             <wp:docPr descr="Diagram 2" title="" id="16" name="Picture"/>
             <a:graphic>
@@ -677,7 +677,7 @@
                   <pic:spPr bwMode="auto">
                     <a:xfrm>
                       <a:off x="0" y="0"/>
-                      <a:ext cx="4165600" cy="1181100"/>
+                      <a:ext cx="5334000" cy="3461247"/>
                     </a:xfrm>
                     <a:prstGeom prst="rect">
                       <a:avLst/>
@@ -1986,7 +1986,7 @@
       <w:r>
         <w:drawing>
           <wp:inline>
-            <wp:extent cx="4140200" cy="1295400"/>
+            <wp:extent cx="5334000" cy="1432891"/>
             <wp:effectExtent b="0" l="0" r="0" t="0"/>
             <wp:docPr descr="Diagram 3" title="" id="22" name="Picture"/>
             <a:graphic>
@@ -2007,7 +2007,7 @@
                   <pic:spPr bwMode="auto">
                     <a:xfrm>
                       <a:off x="0" y="0"/>
-                      <a:ext cx="4140200" cy="1295400"/>
+                      <a:ext cx="5334000" cy="1432891"/>
                     </a:xfrm>
                     <a:prstGeom prst="rect">
                       <a:avLst/>
@@ -2494,7 +2494,7 @@
       <w:r>
         <w:drawing>
           <wp:inline>
-            <wp:extent cx="4114800" cy="2971800"/>
+            <wp:extent cx="5334000" cy="3364906"/>
             <wp:effectExtent b="0" l="0" r="0" t="0"/>
             <wp:docPr descr="Diagram 4" title="" id="27" name="Picture"/>
             <a:graphic>
@@ -2515,7 +2515,7 @@
                   <pic:spPr bwMode="auto">
                     <a:xfrm>
                       <a:off x="0" y="0"/>
-                      <a:ext cx="4114800" cy="2971800"/>
+                      <a:ext cx="5334000" cy="3364906"/>
                     </a:xfrm>
                     <a:prstGeom prst="rect">
                       <a:avLst/>
@@ -2873,7 +2873,7 @@
       <w:r>
         <w:drawing>
           <wp:inline>
-            <wp:extent cx="4114800" cy="2743200"/>
+            <wp:extent cx="5334000" cy="3024261"/>
             <wp:effectExtent b="0" l="0" r="0" t="0"/>
             <wp:docPr descr="Diagram 5" title="" id="32" name="Picture"/>
             <a:graphic>
@@ -2894,7 +2894,7 @@
                   <pic:spPr bwMode="auto">
                     <a:xfrm>
                       <a:off x="0" y="0"/>
-                      <a:ext cx="4114800" cy="2743200"/>
+                      <a:ext cx="5334000" cy="3024261"/>
                     </a:xfrm>
                     <a:prstGeom prst="rect">
                       <a:avLst/>
@@ -3143,7 +3143,7 @@
       <w:r>
         <w:drawing>
           <wp:inline>
-            <wp:extent cx="5334000" cy="4283302"/>
+            <wp:extent cx="5334000" cy="4282094"/>
             <wp:effectExtent b="0" l="0" r="0" t="0"/>
             <wp:docPr descr="Active Inference Phi Simulation Results" title="" id="36" name="Picture"/>
             <a:graphic>
@@ -3164,7 +3164,7 @@
                   <pic:spPr bwMode="auto">
                     <a:xfrm>
                       <a:off x="0" y="0"/>
-                      <a:ext cx="5334000" cy="4283302"/>
+                      <a:ext cx="5334000" cy="4282094"/>
                     </a:xfrm>
                     <a:prstGeom prst="rect">
                       <a:avLst/>

</xml_diff>

<commit_message>
Update subtitle in master paper PDF and DOCX with 'fit together'
</commit_message>
<xml_diff>
--- a/docs/The_Computational_Grounding_of_My_Ontology_Thomas_Riebl.docx
+++ b/docs/The_Computational_Grounding_of_My_Ontology_Thomas_Riebl.docx
@@ -11,7 +11,7 @@
         <w:t xml:space="preserve">The Computational Grounding of My Ontology</w:t>
       </w:r>
     </w:p>
-    <w:bookmarkStart w:id="12" w:name="Xde557870a65e5d3a2f605aeec5032d448dc8a26"/>
+    <w:bookmarkStart w:id="12" w:name="X8c23e84306441c8e7ed7291b8251771510d7fe8"/>
     <w:p>
       <w:pPr>
         <w:pStyle w:val="Heading2"/>
@@ -28,7 +28,7 @@
         </m:r>
       </m:oMath>
       <w:r>
-        <w:t xml:space="preserve">), and the 6th Axiom Unite Analytic Idealism, the Free Energy Principle, and Consciousness</w:t>
+        <w:t xml:space="preserve">), and the 6th Axiom Fit Together to Unite Analytic Idealism, the Free Energy Principle, and Consciousness</w:t>
       </w:r>
     </w:p>
     <w:p>

</xml_diff>

<commit_message>
Add Table of Contents, Bibliography, page numbering, and COG/Gemini attribution to Master Paper
</commit_message>
<xml_diff>
--- a/docs/The_Computational_Grounding_of_My_Ontology_Thomas_Riebl.docx
+++ b/docs/The_Computational_Grounding_of_My_Ontology_Thomas_Riebl.docx
@@ -2,7 +2,7 @@
 <file path=word/document.xml><?xml version="1.0" encoding="utf-8"?>
 <w:document xmlns:w="http://schemas.openxmlformats.org/wordprocessingml/2006/main" xmlns:m="http://schemas.openxmlformats.org/officeDocument/2006/math" xmlns:r="http://schemas.openxmlformats.org/officeDocument/2006/relationships" xmlns:o="urn:schemas-microsoft-com:office:office" xmlns:v="urn:schemas-microsoft-com:vml" xmlns:w10="urn:schemas-microsoft-com:office:word" xmlns:a="http://schemas.openxmlformats.org/drawingml/2006/main" xmlns:pic="http://schemas.openxmlformats.org/drawingml/2006/picture" xmlns:wp="http://schemas.openxmlformats.org/drawingml/2006/wordprocessingDrawing">
   <w:body>
-    <w:bookmarkStart w:id="46" w:name="Xf71904465003dbbe6e55a84ec2c0ae20b9458ba"/>
+    <w:bookmarkStart w:id="49" w:name="Xf71904465003dbbe6e55a84ec2c0ae20b9458ba"/>
     <w:p>
       <w:pPr>
         <w:pStyle w:val="Heading1"/>
@@ -219,173 +219,13 @@
       </w:r>
     </w:p>
     <w:bookmarkEnd w:id="12"/>
-    <w:bookmarkStart w:id="14" w:name="executive-summary-theoretical-thesis"/>
+    <w:bookmarkStart w:id="13" w:name="table-of-contents"/>
     <w:p>
       <w:pPr>
         <w:pStyle w:val="Heading2"/>
       </w:pPr>
       <w:r>
-        <w:t xml:space="preserve">Executive Summary &amp; Theoretical Thesis</w:t>
-      </w:r>
-    </w:p>
-    <w:p>
-      <w:pPr>
-        <w:pStyle w:val="FirstParagraph"/>
-      </w:pPr>
-      <w:r>
-        <w:t xml:space="preserve">The fundamental quest of consciousness research has long been paralyzed by two fragmented paradigms:</w:t>
-      </w:r>
-      <w:r>
-        <w:t xml:space="preserve"> </w:t>
-      </w:r>
-      <w:r>
-        <w:t xml:space="preserve">1.</w:t>
-      </w:r>
-      <w:r>
-        <w:t xml:space="preserve"> </w:t>
-      </w:r>
-      <w:r>
-        <w:rPr>
-          <w:b/>
-          <w:bCs/>
-        </w:rPr>
-        <w:t xml:space="preserve">The Objective 3rd-Person Physicalist Lens (Active Inference &amp; Free Energy Principle):</w:t>
-      </w:r>
-      <w:r>
-        <w:t xml:space="preserve"> </w:t>
-      </w:r>
-      <w:r>
-        <w:t xml:space="preserve">Explaining how self-organizing systems maintain boundaries (</w:t>
-      </w:r>
-      <w:r>
-        <w:rPr>
-          <w:i/>
-          <w:iCs/>
-        </w:rPr>
-        <w:t xml:space="preserve">Markov Blankets</w:t>
-      </w:r>
-      <w:r>
-        <w:t xml:space="preserve">) and minimize entropy, yet remaining silent on why there is</w:t>
-      </w:r>
-      <w:r>
-        <w:t xml:space="preserve"> </w:t>
-      </w:r>
-      <w:r>
-        <w:rPr>
-          <w:i/>
-          <w:iCs/>
-        </w:rPr>
-        <w:t xml:space="preserve">something it is like</w:t>
-      </w:r>
-      <w:r>
-        <w:t xml:space="preserve"> </w:t>
-      </w:r>
-      <w:r>
-        <w:t xml:space="preserve">to be that system.</w:t>
-      </w:r>
-      <w:r>
-        <w:t xml:space="preserve"> </w:t>
-      </w:r>
-      <w:r>
-        <w:t xml:space="preserve">2.</w:t>
-      </w:r>
-      <w:r>
-        <w:t xml:space="preserve"> </w:t>
-      </w:r>
-      <w:r>
-        <w:rPr>
-          <w:b/>
-          <w:bCs/>
-        </w:rPr>
-        <w:t xml:space="preserve">The Subjective 1st-Person Phenomenological Lens (Integrated Information Theory 4.0):</w:t>
-      </w:r>
-      <w:r>
-        <w:t xml:space="preserve"> </w:t>
-      </w:r>
-      <w:r>
-        <w:t xml:space="preserve">Computing the mathematical geometry of intrinsic cause-effect power (</w:t>
-      </w:r>
-      <m:oMath>
-        <m:r>
-          <m:rPr>
-            <m:sty m:val="p"/>
-          </m:rPr>
-          <m:t>Φ</m:t>
-        </m:r>
-      </m:oMath>
-      <w:r>
-        <w:t xml:space="preserve">), yet treating systems as static, lifeless snapshots—which erroneously attributes rich consciousness to fragile, accidental logic circuits (</w:t>
-      </w:r>
-      <w:r>
-        <w:rPr>
-          <w:i/>
-          <w:iCs/>
-        </w:rPr>
-        <w:t xml:space="preserve">The Paradox of Transient Causal Phantoms</w:t>
-      </w:r>
-      <w:r>
-        <w:t xml:space="preserve">).</w:t>
-      </w:r>
-    </w:p>
-    <w:p>
-      <w:pPr>
-        <w:pStyle w:val="BodyText"/>
-      </w:pPr>
-      <w:r>
-        <w:t xml:space="preserve">This paper demonstrates how the recent mathematical formalization, discrete network topology, and Python implementation of an</w:t>
-      </w:r>
-      <w:r>
-        <w:t xml:space="preserve"> </w:t>
-      </w:r>
-      <w:r>
-        <w:rPr>
-          <w:b/>
-          <w:bCs/>
-        </w:rPr>
-        <w:t xml:space="preserve">array of Active Inference agents maximizing Integrated Information (</w:t>
-      </w:r>
-      <m:oMath>
-        <m:r>
-          <m:rPr>
-            <m:sty m:val="p"/>
-          </m:rPr>
-          <m:t>Φ</m:t>
-        </m:r>
-      </m:oMath>
-      <w:r>
-        <w:rPr>
-          <w:b/>
-          <w:bCs/>
-        </w:rPr>
-        <w:t xml:space="preserve">) over time</w:t>
-      </w:r>
-      <w:r>
-        <w:t xml:space="preserve"> </w:t>
-      </w:r>
-      <w:r>
-        <w:t xml:space="preserve">provide the</w:t>
-      </w:r>
-      <w:r>
-        <w:t xml:space="preserve"> </w:t>
-      </w:r>
-      <w:r>
-        <w:rPr>
-          <w:b/>
-          <w:bCs/>
-        </w:rPr>
-        <w:t xml:space="preserve">exact computational grounding for Thomas Riebl’s 5-Pillar Ontology</w:t>
-      </w:r>
-      <w:r>
-        <w:t xml:space="preserve">.</w:t>
-      </w:r>
-    </w:p>
-    <w:bookmarkStart w:id="13" w:name="the-core-breakthrough"/>
-    <w:p>
-      <w:pPr>
-        <w:pStyle w:val="Heading3"/>
-      </w:pPr>
-      <w:r>
-        <w:t xml:space="preserve">The Core Breakthrough:</w:t>
+        <w:t xml:space="preserve">Table of Contents</w:t>
       </w:r>
     </w:p>
     <w:p>
@@ -396,185 +236,14 @@
           <w:numId w:val="1001"/>
         </w:numPr>
       </w:pPr>
-      <w:r>
-        <w:rPr>
-          <w:b/>
-          <w:bCs/>
-        </w:rPr>
-        <w:t xml:space="preserve">The Mathematical Equivalence of Life and Mind:</w:t>
-      </w:r>
-      <w:r>
-        <w:t xml:space="preserve"> </w:t>
-      </w:r>
-      <w:r>
-        <w:t xml:space="preserve">What Karl Friston calculates from the</w:t>
-      </w:r>
-      <w:r>
-        <w:t xml:space="preserve"> </w:t>
-      </w:r>
-      <w:r>
-        <w:rPr>
-          <w:b/>
-          <w:bCs/>
-        </w:rPr>
-        <w:t xml:space="preserve">outside (3rd-person)</w:t>
-      </w:r>
-      <w:r>
-        <w:t xml:space="preserve"> </w:t>
-      </w:r>
-      <w:r>
-        <w:t xml:space="preserve">as the minimization of Expected Free Energy (</w:t>
-      </w:r>
-      <m:oMath>
-        <m:r>
-          <m:t>G</m:t>
-        </m:r>
-      </m:oMath>
-      <w:r>
-        <w:t xml:space="preserve">) across a Markov Blanket is identically what Giulio Tononi and Thomas Riebl define from the</w:t>
-      </w:r>
-      <w:r>
-        <w:t xml:space="preserve"> </w:t>
-      </w:r>
-      <w:r>
-        <w:rPr>
-          <w:b/>
-          <w:bCs/>
-        </w:rPr>
-        <w:t xml:space="preserve">inside (1st-person)</w:t>
-      </w:r>
-      <w:r>
-        <w:t xml:space="preserve"> </w:t>
-      </w:r>
-      <w:r>
-        <w:t xml:space="preserve">as the</w:t>
-      </w:r>
-      <w:r>
-        <w:t xml:space="preserve"> </w:t>
-      </w:r>
-      <w:r>
-        <w:rPr>
-          <w:b/>
-          <w:bCs/>
-        </w:rPr>
-        <w:t xml:space="preserve">Will to Exist (</w:t>
-      </w:r>
-      <w:r>
-        <w:rPr>
-          <w:b/>
-          <w:bCs/>
-          <w:i/>
-          <w:iCs/>
-        </w:rPr>
-        <w:t xml:space="preserve">Conatus</w:t>
-      </w:r>
-      <w:r>
-        <w:rPr>
-          <w:b/>
-          <w:bCs/>
-        </w:rPr>
-        <w:t xml:space="preserve">)</w:t>
-      </w:r>
-      <w:r>
-        <w:t xml:space="preserve"> </w:t>
-      </w:r>
-      <w:r>
-        <w:t xml:space="preserve">autopoietically preserving integrated causal power (</w:t>
-      </w:r>
-      <m:oMath>
-        <m:r>
-          <m:rPr>
-            <m:scr m:val="double-struck"/>
-            <m:sty m:val="p"/>
-          </m:rPr>
-          <m:t>E</m:t>
-        </m:r>
-        <m:r>
-          <m:rPr>
-            <m:sty m:val="p"/>
-          </m:rPr>
-          <m:t>[</m:t>
-        </m:r>
-        <m:r>
-          <m:rPr>
-            <m:sty m:val="p"/>
-          </m:rPr>
-          <m:t>Φ</m:t>
-        </m:r>
-        <m:r>
-          <m:rPr>
-            <m:sty m:val="p"/>
-          </m:rPr>
-          <m:t>(</m:t>
-        </m:r>
-        <m:r>
-          <m:t>t</m:t>
-        </m:r>
-        <m:r>
-          <m:rPr>
-            <m:sty m:val="p"/>
-          </m:rPr>
-          <m:t>+</m:t>
-        </m:r>
-        <m:r>
-          <m:t>1</m:t>
-        </m:r>
-        <m:r>
-          <m:rPr>
-            <m:sty m:val="p"/>
-          </m:rPr>
-          <m:t>)</m:t>
-        </m:r>
-        <m:r>
-          <m:rPr>
-            <m:sty m:val="p"/>
-          </m:rPr>
-          <m:t>∣</m:t>
-        </m:r>
-        <m:r>
-          <m:rPr>
-            <m:nor/>
-            <m:sty m:val="p"/>
-          </m:rPr>
-          <m:t>Action</m:t>
-        </m:r>
-        <m:r>
-          <m:rPr>
-            <m:sty m:val="p"/>
-          </m:rPr>
-          <m:t>]</m:t>
-        </m:r>
-        <m:r>
-          <m:rPr>
-            <m:sty m:val="p"/>
-          </m:rPr>
-          <m:t>≥</m:t>
-        </m:r>
-        <m:r>
-          <m:rPr>
-            <m:sty m:val="p"/>
-          </m:rPr>
-          <m:t>Φ</m:t>
-        </m:r>
-        <m:r>
-          <m:rPr>
-            <m:sty m:val="p"/>
-          </m:rPr>
-          <m:t>(</m:t>
-        </m:r>
-        <m:r>
-          <m:t>t</m:t>
-        </m:r>
-        <m:r>
-          <m:rPr>
-            <m:sty m:val="p"/>
-          </m:rPr>
-          <m:t>)</m:t>
-        </m:r>
-      </m:oMath>
-      <w:r>
-        <w:t xml:space="preserve">).</w:t>
-      </w:r>
+      <w:hyperlink w:anchor="executive-summary--theoretical-thesis">
+        <w:r>
+          <w:rPr>
+            <w:rStyle w:val="Hyperlink"/>
+          </w:rPr>
+          <w:t xml:space="preserve">Executive Summary &amp; Theoretical Thesis</w:t>
+        </w:r>
+      </w:hyperlink>
     </w:p>
     <w:p>
       <w:pPr>
@@ -584,52 +253,145 @@
           <w:numId w:val="1001"/>
         </w:numPr>
       </w:pPr>
-      <w:r>
-        <w:rPr>
-          <w:b/>
-          <w:bCs/>
-        </w:rPr>
-        <w:t xml:space="preserve">The Mechanism of Dissociation:</w:t>
-      </w:r>
-      <w:r>
-        <w:t xml:space="preserve"> </w:t>
-      </w:r>
-      <w:r>
-        <w:t xml:space="preserve">Cosmic Mind (</w:t>
-      </w:r>
-      <w:r>
-        <w:rPr>
-          <w:i/>
-          <w:iCs/>
-        </w:rPr>
-        <w:t xml:space="preserve">Mind-at-Large</w:t>
-      </w:r>
-      <w:r>
-        <w:t xml:space="preserve">) dissociates into individual living entities (</w:t>
-      </w:r>
-      <w:r>
-        <w:rPr>
-          <w:i/>
-          <w:iCs/>
-        </w:rPr>
-        <w:t xml:space="preserve">alters</w:t>
-      </w:r>
-      <w:r>
-        <w:t xml:space="preserve">) when recurrent small-world networks achieve</w:t>
-      </w:r>
-      <w:r>
-        <w:t xml:space="preserve"> </w:t>
-      </w:r>
-      <w:r>
-        <w:rPr>
-          <w:b/>
-          <w:bCs/>
-        </w:rPr>
-        <w:t xml:space="preserve">critical metastability (the Edge of Chaos)</w:t>
-      </w:r>
-      <w:r>
-        <w:t xml:space="preserve">—preserving local differentiation while sustaining global integration.</w:t>
-      </w:r>
+      <w:hyperlink w:anchor="X82d205079ecb60e821484a0228f7da8dd465d68">
+        <w:r>
+          <w:rPr>
+            <w:rStyle w:val="Hyperlink"/>
+          </w:rPr>
+          <w:t xml:space="preserve">1. The 1st-Person / 3rd-Person Equivalence: Friston Meets Tononi &amp; Riebl</w:t>
+        </w:r>
+      </w:hyperlink>
+    </w:p>
+    <w:p>
+      <w:pPr>
+        <w:pStyle w:val="Compact"/>
+        <w:numPr>
+          <w:ilvl w:val="0"/>
+          <w:numId w:val="1001"/>
+        </w:numPr>
+      </w:pPr>
+      <w:hyperlink w:anchor="Xb61d84f24956df2d66d4c2644a48d421d80e68c">
+        <w:r>
+          <w:rPr>
+            <w:rStyle w:val="Hyperlink"/>
+          </w:rPr>
+          <w:t xml:space="preserve">2. The Mechanism of Dissociation in Analytic Idealism</w:t>
+        </w:r>
+      </w:hyperlink>
+    </w:p>
+    <w:p>
+      <w:pPr>
+        <w:pStyle w:val="Compact"/>
+        <w:numPr>
+          <w:ilvl w:val="0"/>
+          <w:numId w:val="1001"/>
+        </w:numPr>
+      </w:pPr>
+      <w:hyperlink w:anchor="Xee27f53220529903137ba2c40a7d54c39108dfd">
+        <w:r>
+          <w:rPr>
+            <w:rStyle w:val="Hyperlink"/>
+          </w:rPr>
+          <w:t xml:space="preserve">3. Demolishing the Paradox of</w:t>
+        </w:r>
+        <w:r>
+          <w:rPr>
+            <w:rStyle w:val="Hyperlink"/>
+          </w:rPr>
+          <w:t xml:space="preserve"> </w:t>
+        </w:r>
+        <w:r>
+          <w:rPr>
+            <w:rStyle w:val="Hyperlink"/>
+          </w:rPr>
+          <w:t xml:space="preserve">“Transient Causal Phantoms”</w:t>
+        </w:r>
+      </w:hyperlink>
+    </w:p>
+    <w:p>
+      <w:pPr>
+        <w:pStyle w:val="Compact"/>
+        <w:numPr>
+          <w:ilvl w:val="0"/>
+          <w:numId w:val="1001"/>
+        </w:numPr>
+      </w:pPr>
+      <w:hyperlink w:anchor="X968659e8830d836ca9d5b500f5178fb15979639">
+        <w:r>
+          <w:rPr>
+            <w:rStyle w:val="Hyperlink"/>
+          </w:rPr>
+          <w:t xml:space="preserve">4. The Epistemology of Self-Inquiry: Metzinger, Roth, and the Mirror of Mind</w:t>
+        </w:r>
+      </w:hyperlink>
+    </w:p>
+    <w:p>
+      <w:pPr>
+        <w:pStyle w:val="Compact"/>
+        <w:numPr>
+          <w:ilvl w:val="0"/>
+          <w:numId w:val="1001"/>
+        </w:numPr>
+      </w:pPr>
+      <w:hyperlink w:anchor="Xef4346ae1a20420f4e608f71a098cf567427e82">
+        <w:r>
+          <w:rPr>
+            <w:rStyle w:val="Hyperlink"/>
+          </w:rPr>
+          <w:t xml:space="preserve">5. Computational and Experimental Validation</w:t>
+        </w:r>
+      </w:hyperlink>
+    </w:p>
+    <w:p>
+      <w:pPr>
+        <w:pStyle w:val="Compact"/>
+        <w:numPr>
+          <w:ilvl w:val="0"/>
+          <w:numId w:val="1001"/>
+        </w:numPr>
+      </w:pPr>
+      <w:hyperlink w:anchor="X79ae71bbe89eaa2c77ce6919e0f8668a553af5e">
+        <w:r>
+          <w:rPr>
+            <w:rStyle w:val="Hyperlink"/>
+          </w:rPr>
+          <w:t xml:space="preserve">6. Conclusion: The Unified Science of Mind</w:t>
+        </w:r>
+      </w:hyperlink>
+    </w:p>
+    <w:p>
+      <w:pPr>
+        <w:pStyle w:val="Compact"/>
+        <w:numPr>
+          <w:ilvl w:val="0"/>
+          <w:numId w:val="1001"/>
+        </w:numPr>
+      </w:pPr>
+      <w:hyperlink w:anchor="X12b8c24ff07f4715474ee8e08480e3657266d8f">
+        <w:r>
+          <w:rPr>
+            <w:rStyle w:val="Hyperlink"/>
+          </w:rPr>
+          <w:t xml:space="preserve">7. References &amp; Academic Bibliography</w:t>
+        </w:r>
+      </w:hyperlink>
+    </w:p>
+    <w:p>
+      <w:pPr>
+        <w:pStyle w:val="Compact"/>
+        <w:numPr>
+          <w:ilvl w:val="0"/>
+          <w:numId w:val="1001"/>
+        </w:numPr>
+      </w:pPr>
+      <w:hyperlink w:anchor="X104d46987186aa5bae9f91b004cc1484b8f45fc">
+        <w:r>
+          <w:rPr>
+            <w:rStyle w:val="Hyperlink"/>
+          </w:rPr>
+          <w:t xml:space="preserve">8. Tool Attribution &amp; Colophon</w:t>
+        </w:r>
+      </w:hyperlink>
     </w:p>
     <w:p>
       <w:r>
@@ -639,8 +401,428 @@
       </w:r>
     </w:p>
     <w:bookmarkEnd w:id="13"/>
+    <w:bookmarkStart w:id="15" w:name="executive-summary-theoretical-thesis"/>
+    <w:p>
+      <w:pPr>
+        <w:pStyle w:val="Heading2"/>
+      </w:pPr>
+      <w:r>
+        <w:t xml:space="preserve">Executive Summary &amp; Theoretical Thesis</w:t>
+      </w:r>
+    </w:p>
+    <w:p>
+      <w:pPr>
+        <w:pStyle w:val="FirstParagraph"/>
+      </w:pPr>
+      <w:r>
+        <w:t xml:space="preserve">The fundamental quest of consciousness research has long been paralyzed by two fragmented paradigms:</w:t>
+      </w:r>
+      <w:r>
+        <w:t xml:space="preserve"> </w:t>
+      </w:r>
+      <w:r>
+        <w:t xml:space="preserve">1.</w:t>
+      </w:r>
+      <w:r>
+        <w:t xml:space="preserve"> </w:t>
+      </w:r>
+      <w:r>
+        <w:rPr>
+          <w:b/>
+          <w:bCs/>
+        </w:rPr>
+        <w:t xml:space="preserve">The Objective 3rd-Person Physicalist Lens (Active Inference &amp; Free Energy Principle):</w:t>
+      </w:r>
+      <w:r>
+        <w:t xml:space="preserve"> </w:t>
+      </w:r>
+      <w:r>
+        <w:t xml:space="preserve">Explaining how self-organizing systems maintain boundaries (</w:t>
+      </w:r>
+      <w:r>
+        <w:rPr>
+          <w:i/>
+          <w:iCs/>
+        </w:rPr>
+        <w:t xml:space="preserve">Markov Blankets</w:t>
+      </w:r>
+      <w:r>
+        <w:t xml:space="preserve">) and minimize entropy, yet remaining silent on why there is</w:t>
+      </w:r>
+      <w:r>
+        <w:t xml:space="preserve"> </w:t>
+      </w:r>
+      <w:r>
+        <w:rPr>
+          <w:i/>
+          <w:iCs/>
+        </w:rPr>
+        <w:t xml:space="preserve">something it is like</w:t>
+      </w:r>
+      <w:r>
+        <w:t xml:space="preserve"> </w:t>
+      </w:r>
+      <w:r>
+        <w:t xml:space="preserve">to be that system.</w:t>
+      </w:r>
+      <w:r>
+        <w:t xml:space="preserve"> </w:t>
+      </w:r>
+      <w:r>
+        <w:t xml:space="preserve">2.</w:t>
+      </w:r>
+      <w:r>
+        <w:t xml:space="preserve"> </w:t>
+      </w:r>
+      <w:r>
+        <w:rPr>
+          <w:b/>
+          <w:bCs/>
+        </w:rPr>
+        <w:t xml:space="preserve">The Subjective 1st-Person Phenomenological Lens (Integrated Information Theory 4.0):</w:t>
+      </w:r>
+      <w:r>
+        <w:t xml:space="preserve"> </w:t>
+      </w:r>
+      <w:r>
+        <w:t xml:space="preserve">Computing the mathematical geometry of intrinsic cause-effect power (</w:t>
+      </w:r>
+      <m:oMath>
+        <m:r>
+          <m:rPr>
+            <m:sty m:val="p"/>
+          </m:rPr>
+          <m:t>Φ</m:t>
+        </m:r>
+      </m:oMath>
+      <w:r>
+        <w:t xml:space="preserve">), yet treating systems as static, lifeless snapshots—which erroneously attributes rich consciousness to fragile, accidental logic circuits (</w:t>
+      </w:r>
+      <w:r>
+        <w:rPr>
+          <w:i/>
+          <w:iCs/>
+        </w:rPr>
+        <w:t xml:space="preserve">The Paradox of Transient Causal Phantoms</w:t>
+      </w:r>
+      <w:r>
+        <w:t xml:space="preserve">).</w:t>
+      </w:r>
+    </w:p>
+    <w:p>
+      <w:pPr>
+        <w:pStyle w:val="BodyText"/>
+      </w:pPr>
+      <w:r>
+        <w:t xml:space="preserve">This paper demonstrates how the recent mathematical formalization, discrete network topology, and Python implementation of an</w:t>
+      </w:r>
+      <w:r>
+        <w:t xml:space="preserve"> </w:t>
+      </w:r>
+      <w:r>
+        <w:rPr>
+          <w:b/>
+          <w:bCs/>
+        </w:rPr>
+        <w:t xml:space="preserve">array of Active Inference agents maximizing Integrated Information (</w:t>
+      </w:r>
+      <m:oMath>
+        <m:r>
+          <m:rPr>
+            <m:sty m:val="p"/>
+          </m:rPr>
+          <m:t>Φ</m:t>
+        </m:r>
+      </m:oMath>
+      <w:r>
+        <w:rPr>
+          <w:b/>
+          <w:bCs/>
+        </w:rPr>
+        <w:t xml:space="preserve">) over time</w:t>
+      </w:r>
+      <w:r>
+        <w:t xml:space="preserve"> </w:t>
+      </w:r>
+      <w:r>
+        <w:t xml:space="preserve">provide the</w:t>
+      </w:r>
+      <w:r>
+        <w:t xml:space="preserve"> </w:t>
+      </w:r>
+      <w:r>
+        <w:rPr>
+          <w:b/>
+          <w:bCs/>
+        </w:rPr>
+        <w:t xml:space="preserve">exact computational grounding for Thomas Riebl’s 5-Pillar Ontology</w:t>
+      </w:r>
+      <w:r>
+        <w:t xml:space="preserve">.</w:t>
+      </w:r>
+    </w:p>
+    <w:bookmarkStart w:id="14" w:name="the-core-breakthrough"/>
+    <w:p>
+      <w:pPr>
+        <w:pStyle w:val="Heading3"/>
+      </w:pPr>
+      <w:r>
+        <w:t xml:space="preserve">The Core Breakthrough:</w:t>
+      </w:r>
+    </w:p>
+    <w:p>
+      <w:pPr>
+        <w:pStyle w:val="Compact"/>
+        <w:numPr>
+          <w:ilvl w:val="0"/>
+          <w:numId w:val="1002"/>
+        </w:numPr>
+      </w:pPr>
+      <w:r>
+        <w:rPr>
+          <w:b/>
+          <w:bCs/>
+        </w:rPr>
+        <w:t xml:space="preserve">The Mathematical Equivalence of Life and Mind:</w:t>
+      </w:r>
+      <w:r>
+        <w:t xml:space="preserve"> </w:t>
+      </w:r>
+      <w:r>
+        <w:t xml:space="preserve">What Karl Friston calculates from the</w:t>
+      </w:r>
+      <w:r>
+        <w:t xml:space="preserve"> </w:t>
+      </w:r>
+      <w:r>
+        <w:rPr>
+          <w:b/>
+          <w:bCs/>
+        </w:rPr>
+        <w:t xml:space="preserve">outside (3rd-person)</w:t>
+      </w:r>
+      <w:r>
+        <w:t xml:space="preserve"> </w:t>
+      </w:r>
+      <w:r>
+        <w:t xml:space="preserve">as the minimization of Expected Free Energy (</w:t>
+      </w:r>
+      <m:oMath>
+        <m:r>
+          <m:t>G</m:t>
+        </m:r>
+      </m:oMath>
+      <w:r>
+        <w:t xml:space="preserve">) across a Markov Blanket is identically what Giulio Tononi and Thomas Riebl define from the</w:t>
+      </w:r>
+      <w:r>
+        <w:t xml:space="preserve"> </w:t>
+      </w:r>
+      <w:r>
+        <w:rPr>
+          <w:b/>
+          <w:bCs/>
+        </w:rPr>
+        <w:t xml:space="preserve">inside (1st-person)</w:t>
+      </w:r>
+      <w:r>
+        <w:t xml:space="preserve"> </w:t>
+      </w:r>
+      <w:r>
+        <w:t xml:space="preserve">as the</w:t>
+      </w:r>
+      <w:r>
+        <w:t xml:space="preserve"> </w:t>
+      </w:r>
+      <w:r>
+        <w:rPr>
+          <w:b/>
+          <w:bCs/>
+        </w:rPr>
+        <w:t xml:space="preserve">Will to Exist (</w:t>
+      </w:r>
+      <w:r>
+        <w:rPr>
+          <w:b/>
+          <w:bCs/>
+          <w:i/>
+          <w:iCs/>
+        </w:rPr>
+        <w:t xml:space="preserve">Conatus</w:t>
+      </w:r>
+      <w:r>
+        <w:rPr>
+          <w:b/>
+          <w:bCs/>
+        </w:rPr>
+        <w:t xml:space="preserve">)</w:t>
+      </w:r>
+      <w:r>
+        <w:t xml:space="preserve"> </w:t>
+      </w:r>
+      <w:r>
+        <w:t xml:space="preserve">autopoietically preserving integrated causal power (</w:t>
+      </w:r>
+      <m:oMath>
+        <m:r>
+          <m:rPr>
+            <m:scr m:val="double-struck"/>
+            <m:sty m:val="p"/>
+          </m:rPr>
+          <m:t>E</m:t>
+        </m:r>
+        <m:r>
+          <m:rPr>
+            <m:sty m:val="p"/>
+          </m:rPr>
+          <m:t>[</m:t>
+        </m:r>
+        <m:r>
+          <m:rPr>
+            <m:sty m:val="p"/>
+          </m:rPr>
+          <m:t>Φ</m:t>
+        </m:r>
+        <m:r>
+          <m:rPr>
+            <m:sty m:val="p"/>
+          </m:rPr>
+          <m:t>(</m:t>
+        </m:r>
+        <m:r>
+          <m:t>t</m:t>
+        </m:r>
+        <m:r>
+          <m:rPr>
+            <m:sty m:val="p"/>
+          </m:rPr>
+          <m:t>+</m:t>
+        </m:r>
+        <m:r>
+          <m:t>1</m:t>
+        </m:r>
+        <m:r>
+          <m:rPr>
+            <m:sty m:val="p"/>
+          </m:rPr>
+          <m:t>)</m:t>
+        </m:r>
+        <m:r>
+          <m:rPr>
+            <m:sty m:val="p"/>
+          </m:rPr>
+          <m:t>∣</m:t>
+        </m:r>
+        <m:r>
+          <m:rPr>
+            <m:nor/>
+            <m:sty m:val="p"/>
+          </m:rPr>
+          <m:t>Action</m:t>
+        </m:r>
+        <m:r>
+          <m:rPr>
+            <m:sty m:val="p"/>
+          </m:rPr>
+          <m:t>]</m:t>
+        </m:r>
+        <m:r>
+          <m:rPr>
+            <m:sty m:val="p"/>
+          </m:rPr>
+          <m:t>≥</m:t>
+        </m:r>
+        <m:r>
+          <m:rPr>
+            <m:sty m:val="p"/>
+          </m:rPr>
+          <m:t>Φ</m:t>
+        </m:r>
+        <m:r>
+          <m:rPr>
+            <m:sty m:val="p"/>
+          </m:rPr>
+          <m:t>(</m:t>
+        </m:r>
+        <m:r>
+          <m:t>t</m:t>
+        </m:r>
+        <m:r>
+          <m:rPr>
+            <m:sty m:val="p"/>
+          </m:rPr>
+          <m:t>)</m:t>
+        </m:r>
+      </m:oMath>
+      <w:r>
+        <w:t xml:space="preserve">).</w:t>
+      </w:r>
+    </w:p>
+    <w:p>
+      <w:pPr>
+        <w:pStyle w:val="Compact"/>
+        <w:numPr>
+          <w:ilvl w:val="0"/>
+          <w:numId w:val="1002"/>
+        </w:numPr>
+      </w:pPr>
+      <w:r>
+        <w:rPr>
+          <w:b/>
+          <w:bCs/>
+        </w:rPr>
+        <w:t xml:space="preserve">The Mechanism of Dissociation:</w:t>
+      </w:r>
+      <w:r>
+        <w:t xml:space="preserve"> </w:t>
+      </w:r>
+      <w:r>
+        <w:t xml:space="preserve">Cosmic Mind (</w:t>
+      </w:r>
+      <w:r>
+        <w:rPr>
+          <w:i/>
+          <w:iCs/>
+        </w:rPr>
+        <w:t xml:space="preserve">Mind-at-Large</w:t>
+      </w:r>
+      <w:r>
+        <w:t xml:space="preserve">) dissociates into individual living entities (</w:t>
+      </w:r>
+      <w:r>
+        <w:rPr>
+          <w:i/>
+          <w:iCs/>
+        </w:rPr>
+        <w:t xml:space="preserve">alters</w:t>
+      </w:r>
+      <w:r>
+        <w:t xml:space="preserve">) when recurrent small-world networks achieve</w:t>
+      </w:r>
+      <w:r>
+        <w:t xml:space="preserve"> </w:t>
+      </w:r>
+      <w:r>
+        <w:rPr>
+          <w:b/>
+          <w:bCs/>
+        </w:rPr>
+        <w:t xml:space="preserve">critical metastability (the Edge of Chaos)</w:t>
+      </w:r>
+      <w:r>
+        <w:t xml:space="preserve">—preserving local differentiation while sustaining global integration.</w:t>
+      </w:r>
+    </w:p>
+    <w:p>
+      <w:r>
+        <w:pict>
+          <v:rect style="width:0;height:1.5pt" o:hralign="center" o:hrstd="t" o:hr="t"/>
+        </w:pict>
+      </w:r>
+    </w:p>
     <w:bookmarkEnd w:id="14"/>
-    <w:bookmarkStart w:id="20" w:name="X741a1401dce01ac86d9292967b8d17deebce096"/>
+    <w:bookmarkEnd w:id="15"/>
+    <w:bookmarkStart w:id="21" w:name="X741a1401dce01ac86d9292967b8d17deebce096"/>
     <w:p>
       <w:pPr>
         <w:pStyle w:val="Heading2"/>
@@ -658,18 +840,18 @@
           <wp:inline>
             <wp:extent cx="5334000" cy="3461247"/>
             <wp:effectExtent b="0" l="0" r="0" t="0"/>
-            <wp:docPr descr="Diagram 2" title="" id="16" name="Picture"/>
+            <wp:docPr descr="Diagram 2" title="" id="17" name="Picture"/>
             <a:graphic>
               <a:graphicData uri="http://schemas.openxmlformats.org/drawingml/2006/picture">
                 <pic:pic>
                   <pic:nvPicPr>
-                    <pic:cNvPr descr="/tmp/docx_diagrams_computational_grounding/diagram_1.png" id="17" name="Picture"/>
+                    <pic:cNvPr descr="/tmp/docx_diagrams_computational_grounding/diagram_1.png" id="18" name="Picture"/>
                     <pic:cNvPicPr>
                       <a:picLocks noChangeArrowheads="1" noChangeAspect="1"/>
                     </pic:cNvPicPr>
                   </pic:nvPicPr>
                   <pic:blipFill>
-                    <a:blip r:embed="rId15"/>
+                    <a:blip r:embed="rId16"/>
                     <a:stretch>
                       <a:fillRect/>
                     </a:stretch>
@@ -725,7 +907,7 @@
         <w:t xml:space="preserve">:</w:t>
       </w:r>
     </w:p>
-    <w:bookmarkStart w:id="18" w:name="the-mathematical-mapping"/>
+    <w:bookmarkStart w:id="19" w:name="the-mathematical-mapping"/>
     <w:p>
       <w:pPr>
         <w:pStyle w:val="Heading3"/>
@@ -739,7 +921,7 @@
         <w:pStyle w:val="Compact"/>
         <w:numPr>
           <w:ilvl w:val="0"/>
-          <w:numId w:val="1002"/>
+          <w:numId w:val="1003"/>
         </w:numPr>
       </w:pPr>
       <w:r>
@@ -1300,7 +1482,7 @@
         <w:pStyle w:val="Compact"/>
         <w:numPr>
           <w:ilvl w:val="0"/>
-          <w:numId w:val="1002"/>
+          <w:numId w:val="1003"/>
         </w:numPr>
       </w:pPr>
       <w:r>
@@ -1789,8 +1971,8 @@
         </m:oMath>
       </m:oMathPara>
     </w:p>
-    <w:bookmarkEnd w:id="18"/>
-    <w:bookmarkStart w:id="19" w:name="the-empirical-proof-in-code"/>
+    <w:bookmarkEnd w:id="19"/>
+    <w:bookmarkStart w:id="20" w:name="the-empirical-proof-in-code"/>
     <w:p>
       <w:pPr>
         <w:pStyle w:val="Heading3"/>
@@ -1882,9 +2064,9 @@
         </w:pict>
       </w:r>
     </w:p>
-    <w:bookmarkEnd w:id="19"/>
     <w:bookmarkEnd w:id="20"/>
-    <w:bookmarkStart w:id="25" w:name="X1d3a41d9311759ebd6eadc22c4bc0b2ade77d78"/>
+    <w:bookmarkEnd w:id="21"/>
+    <w:bookmarkStart w:id="26" w:name="X1d3a41d9311759ebd6eadc22c4bc0b2ade77d78"/>
     <w:p>
       <w:pPr>
         <w:pStyle w:val="Heading2"/>
@@ -1988,18 +2170,18 @@
           <wp:inline>
             <wp:extent cx="5334000" cy="1432891"/>
             <wp:effectExtent b="0" l="0" r="0" t="0"/>
-            <wp:docPr descr="Diagram 3" title="" id="22" name="Picture"/>
+            <wp:docPr descr="Diagram 3" title="" id="23" name="Picture"/>
             <a:graphic>
               <a:graphicData uri="http://schemas.openxmlformats.org/drawingml/2006/picture">
                 <pic:pic>
                   <pic:nvPicPr>
-                    <pic:cNvPr descr="/tmp/docx_diagrams_computational_grounding/diagram_2.png" id="23" name="Picture"/>
+                    <pic:cNvPr descr="/tmp/docx_diagrams_computational_grounding/diagram_2.png" id="24" name="Picture"/>
                     <pic:cNvPicPr>
                       <a:picLocks noChangeArrowheads="1" noChangeAspect="1"/>
                     </pic:cNvPicPr>
                   </pic:nvPicPr>
                   <pic:blipFill>
-                    <a:blip r:embed="rId21"/>
+                    <a:blip r:embed="rId22"/>
                     <a:stretch>
                       <a:fillRect/>
                     </a:stretch>
@@ -2034,7 +2216,7 @@
         <w:t xml:space="preserve">Diagram 3</w:t>
       </w:r>
     </w:p>
-    <w:bookmarkStart w:id="24" w:name="the-three-regimes-of-coupling"/>
+    <w:bookmarkStart w:id="25" w:name="the-three-regimes-of-coupling"/>
     <w:p>
       <w:pPr>
         <w:pStyle w:val="Heading3"/>
@@ -2048,7 +2230,7 @@
         <w:pStyle w:val="Compact"/>
         <w:numPr>
           <w:ilvl w:val="0"/>
-          <w:numId w:val="1003"/>
+          <w:numId w:val="1004"/>
         </w:numPr>
       </w:pPr>
       <w:r>
@@ -2123,7 +2305,7 @@
         <w:pStyle w:val="Compact"/>
         <w:numPr>
           <w:ilvl w:val="0"/>
-          <w:numId w:val="1003"/>
+          <w:numId w:val="1004"/>
         </w:numPr>
       </w:pPr>
       <w:r>
@@ -2210,7 +2392,7 @@
         <w:pStyle w:val="Compact"/>
         <w:numPr>
           <w:ilvl w:val="0"/>
-          <w:numId w:val="1003"/>
+          <w:numId w:val="1004"/>
         </w:numPr>
       </w:pPr>
       <w:r>
@@ -2385,9 +2567,9 @@
         </w:pict>
       </w:r>
     </w:p>
-    <w:bookmarkEnd w:id="24"/>
     <w:bookmarkEnd w:id="25"/>
-    <w:bookmarkStart w:id="30" w:name="Xcf24a24a6c92915bb558287e25fafb306829473"/>
+    <w:bookmarkEnd w:id="26"/>
+    <w:bookmarkStart w:id="31" w:name="Xcf24a24a6c92915bb558287e25fafb306829473"/>
     <w:p>
       <w:pPr>
         <w:pStyle w:val="Heading2"/>
@@ -2496,18 +2678,18 @@
           <wp:inline>
             <wp:extent cx="5334000" cy="3364906"/>
             <wp:effectExtent b="0" l="0" r="0" t="0"/>
-            <wp:docPr descr="Diagram 4" title="" id="27" name="Picture"/>
+            <wp:docPr descr="Diagram 4" title="" id="28" name="Picture"/>
             <a:graphic>
               <a:graphicData uri="http://schemas.openxmlformats.org/drawingml/2006/picture">
                 <pic:pic>
                   <pic:nvPicPr>
-                    <pic:cNvPr descr="/tmp/docx_diagrams_computational_grounding/diagram_3.png" id="28" name="Picture"/>
+                    <pic:cNvPr descr="/tmp/docx_diagrams_computational_grounding/diagram_3.png" id="29" name="Picture"/>
                     <pic:cNvPicPr>
                       <a:picLocks noChangeArrowheads="1" noChangeAspect="1"/>
                     </pic:cNvPicPr>
                   </pic:nvPicPr>
                   <pic:blipFill>
-                    <a:blip r:embed="rId26"/>
+                    <a:blip r:embed="rId27"/>
                     <a:stretch>
                       <a:fillRect/>
                     </a:stretch>
@@ -2542,7 +2724,7 @@
         <w:t xml:space="preserve">Diagram 4</w:t>
       </w:r>
     </w:p>
-    <w:bookmarkStart w:id="29" w:name="the-resolution-by-the-6th-axiom"/>
+    <w:bookmarkStart w:id="30" w:name="the-resolution-by-the-6th-axiom"/>
     <w:p>
       <w:pPr>
         <w:pStyle w:val="Heading3"/>
@@ -2556,7 +2738,7 @@
         <w:pStyle w:val="Compact"/>
         <w:numPr>
           <w:ilvl w:val="0"/>
-          <w:numId w:val="1004"/>
+          <w:numId w:val="1005"/>
         </w:numPr>
       </w:pPr>
       <w:r>
@@ -2657,7 +2839,7 @@
         <w:pStyle w:val="Compact"/>
         <w:numPr>
           <w:ilvl w:val="0"/>
-          <w:numId w:val="1004"/>
+          <w:numId w:val="1005"/>
         </w:numPr>
       </w:pPr>
       <w:r>
@@ -2814,9 +2996,9 @@
         </w:pict>
       </w:r>
     </w:p>
-    <w:bookmarkEnd w:id="29"/>
     <w:bookmarkEnd w:id="30"/>
-    <w:bookmarkStart w:id="34" w:name="X3cc4dd3dd474d31cfd90ebc6d8a3d8629b1289a"/>
+    <w:bookmarkEnd w:id="31"/>
+    <w:bookmarkStart w:id="35" w:name="X3cc4dd3dd474d31cfd90ebc6d8a3d8629b1289a"/>
     <w:p>
       <w:pPr>
         <w:pStyle w:val="Heading2"/>
@@ -2875,18 +3057,18 @@
           <wp:inline>
             <wp:extent cx="5334000" cy="3024261"/>
             <wp:effectExtent b="0" l="0" r="0" t="0"/>
-            <wp:docPr descr="Diagram 5" title="" id="32" name="Picture"/>
+            <wp:docPr descr="Diagram 5" title="" id="33" name="Picture"/>
             <a:graphic>
               <a:graphicData uri="http://schemas.openxmlformats.org/drawingml/2006/picture">
                 <pic:pic>
                   <pic:nvPicPr>
-                    <pic:cNvPr descr="/tmp/docx_diagrams_computational_grounding/diagram_4.png" id="33" name="Picture"/>
+                    <pic:cNvPr descr="/tmp/docx_diagrams_computational_grounding/diagram_4.png" id="34" name="Picture"/>
                     <pic:cNvPicPr>
                       <a:picLocks noChangeArrowheads="1" noChangeAspect="1"/>
                     </pic:cNvPicPr>
                   </pic:nvPicPr>
                   <pic:blipFill>
-                    <a:blip r:embed="rId31"/>
+                    <a:blip r:embed="rId32"/>
                     <a:stretch>
                       <a:fillRect/>
                     </a:stretch>
@@ -2926,7 +3108,7 @@
         <w:pStyle w:val="Compact"/>
         <w:numPr>
           <w:ilvl w:val="0"/>
-          <w:numId w:val="1005"/>
+          <w:numId w:val="1006"/>
         </w:numPr>
       </w:pPr>
       <w:r>
@@ -2990,7 +3172,7 @@
         <w:pStyle w:val="Compact"/>
         <w:numPr>
           <w:ilvl w:val="0"/>
-          <w:numId w:val="1005"/>
+          <w:numId w:val="1006"/>
         </w:numPr>
       </w:pPr>
       <w:r>
@@ -3057,7 +3239,7 @@
         <w:pStyle w:val="Compact"/>
         <w:numPr>
           <w:ilvl w:val="0"/>
-          <w:numId w:val="1005"/>
+          <w:numId w:val="1006"/>
         </w:numPr>
       </w:pPr>
       <w:r>
@@ -3118,8 +3300,8 @@
         </w:pict>
       </w:r>
     </w:p>
-    <w:bookmarkEnd w:id="34"/>
-    <w:bookmarkStart w:id="39" w:name="Xcd0fe30f13b57cca3d052d1f5cb3cb5578c627f"/>
+    <w:bookmarkEnd w:id="35"/>
+    <w:bookmarkStart w:id="40" w:name="Xcd0fe30f13b57cca3d052d1f5cb3cb5578c627f"/>
     <w:p>
       <w:pPr>
         <w:pStyle w:val="Heading2"/>
@@ -3145,18 +3327,18 @@
           <wp:inline>
             <wp:extent cx="5334000" cy="4282094"/>
             <wp:effectExtent b="0" l="0" r="0" t="0"/>
-            <wp:docPr descr="Active Inference Phi Simulation Results" title="" id="36" name="Picture"/>
+            <wp:docPr descr="Active Inference Phi Simulation Results" title="" id="37" name="Picture"/>
             <a:graphic>
               <a:graphicData uri="http://schemas.openxmlformats.org/drawingml/2006/picture">
                 <pic:pic>
                   <pic:nvPicPr>
-                    <pic:cNvPr descr="/home/thr/Documents/active-inference-phi-network/images/active_inference_phi_results.png" id="37" name="Picture"/>
+                    <pic:cNvPr descr="/home/thr/Documents/active-inference-phi-network/images/active_inference_phi_results.png" id="38" name="Picture"/>
                     <pic:cNvPicPr>
                       <a:picLocks noChangeArrowheads="1" noChangeAspect="1"/>
                     </pic:cNvPicPr>
                   </pic:nvPicPr>
                   <pic:blipFill>
-                    <a:blip r:embed="rId35"/>
+                    <a:blip r:embed="rId36"/>
                     <a:stretch>
                       <a:fillRect/>
                     </a:stretch>
@@ -3191,7 +3373,7 @@
         <w:t xml:space="preserve">Active Inference Phi Simulation Results</w:t>
       </w:r>
     </w:p>
-    <w:bookmarkStart w:id="38" w:name="summary-of-empirical-metrics"/>
+    <w:bookmarkStart w:id="39" w:name="summary-of-empirical-metrics"/>
     <w:p>
       <w:pPr>
         <w:pStyle w:val="Heading3"/>
@@ -3205,7 +3387,7 @@
         <w:pStyle w:val="Compact"/>
         <w:numPr>
           <w:ilvl w:val="0"/>
-          <w:numId w:val="1006"/>
+          <w:numId w:val="1007"/>
         </w:numPr>
       </w:pPr>
       <w:r>
@@ -3284,7 +3466,7 @@
         <w:pStyle w:val="Compact"/>
         <w:numPr>
           <w:ilvl w:val="0"/>
-          <w:numId w:val="1006"/>
+          <w:numId w:val="1007"/>
         </w:numPr>
       </w:pPr>
       <w:r>
@@ -3363,7 +3545,7 @@
         <w:pStyle w:val="Compact"/>
         <w:numPr>
           <w:ilvl w:val="0"/>
-          <w:numId w:val="1006"/>
+          <w:numId w:val="1007"/>
         </w:numPr>
       </w:pPr>
       <w:r>
@@ -3557,9 +3739,9 @@
         </w:pict>
       </w:r>
     </w:p>
-    <w:bookmarkEnd w:id="38"/>
     <w:bookmarkEnd w:id="39"/>
-    <w:bookmarkStart w:id="45" w:name="conclusion-the-unified-science-of-mind"/>
+    <w:bookmarkEnd w:id="40"/>
+    <w:bookmarkStart w:id="41" w:name="conclusion-the-unified-science-of-mind"/>
     <w:p>
       <w:pPr>
         <w:pStyle w:val="Heading2"/>
@@ -4093,13 +4275,14 @@
         </w:pict>
       </w:r>
     </w:p>
-    <w:bookmarkStart w:id="44" w:name="vault-repository-references"/>
-    <w:p>
-      <w:pPr>
-        <w:pStyle w:val="Heading3"/>
-      </w:pPr>
-      <w:r>
-        <w:t xml:space="preserve">Vault &amp; Repository References</w:t>
+    <w:bookmarkEnd w:id="41"/>
+    <w:bookmarkStart w:id="42" w:name="references-academic-bibliography"/>
+    <w:p>
+      <w:pPr>
+        <w:pStyle w:val="Heading2"/>
+      </w:pPr>
+      <w:r>
+        <w:t xml:space="preserve">7. References &amp; Academic Bibliography</w:t>
       </w:r>
     </w:p>
     <w:p>
@@ -4107,7 +4290,7 @@
         <w:pStyle w:val="Compact"/>
         <w:numPr>
           <w:ilvl w:val="0"/>
-          <w:numId w:val="1007"/>
+          <w:numId w:val="1008"/>
         </w:numPr>
       </w:pPr>
       <w:r>
@@ -4115,12 +4298,631 @@
           <w:b/>
           <w:bCs/>
         </w:rPr>
+        <w:t xml:space="preserve">Albantakis, L., Barbosa, L., Findlay, G., Grasso, M., Haun, A. M., Marshall, W., Mayner, W. G., Saeed, A. B., &amp; Tononi, G. (2023).</w:t>
+      </w:r>
+      <w:r>
+        <w:t xml:space="preserve"> </w:t>
+      </w:r>
+      <w:r>
+        <w:rPr>
+          <w:i/>
+          <w:iCs/>
+        </w:rPr>
+        <w:t xml:space="preserve">Integrated information theory (IIT) 4.0: Formulating the properties of phenomenal existence in physical terms.</w:t>
+      </w:r>
+      <w:r>
+        <w:t xml:space="preserve"> </w:t>
+      </w:r>
+      <w:r>
+        <w:t xml:space="preserve">PLOS Computational Biology, 19(10), e1011465.</w:t>
+      </w:r>
+    </w:p>
+    <w:p>
+      <w:pPr>
+        <w:pStyle w:val="Compact"/>
+        <w:numPr>
+          <w:ilvl w:val="0"/>
+          <w:numId w:val="1008"/>
+        </w:numPr>
+      </w:pPr>
+      <w:r>
+        <w:rPr>
+          <w:b/>
+          <w:bCs/>
+        </w:rPr>
+        <w:t xml:space="preserve">Barrett, A. B., &amp; Seth, A. K. (2011).</w:t>
+      </w:r>
+      <w:r>
+        <w:t xml:space="preserve"> </w:t>
+      </w:r>
+      <w:r>
+        <w:rPr>
+          <w:i/>
+          <w:iCs/>
+        </w:rPr>
+        <w:t xml:space="preserve">Practical measures of integrated information for time-series data.</w:t>
+      </w:r>
+      <w:r>
+        <w:t xml:space="preserve"> </w:t>
+      </w:r>
+      <w:r>
+        <w:t xml:space="preserve">PLoS Computational Biology, 7(1), e1001052.</w:t>
+      </w:r>
+    </w:p>
+    <w:p>
+      <w:pPr>
+        <w:pStyle w:val="Compact"/>
+        <w:numPr>
+          <w:ilvl w:val="0"/>
+          <w:numId w:val="1008"/>
+        </w:numPr>
+      </w:pPr>
+      <w:r>
+        <w:rPr>
+          <w:b/>
+          <w:bCs/>
+        </w:rPr>
+        <w:t xml:space="preserve">Friston, K. (2010).</w:t>
+      </w:r>
+      <w:r>
+        <w:t xml:space="preserve"> </w:t>
+      </w:r>
+      <w:r>
+        <w:rPr>
+          <w:i/>
+          <w:iCs/>
+        </w:rPr>
+        <w:t xml:space="preserve">The free-energy principle: a unified brain theory?</w:t>
+      </w:r>
+      <w:r>
+        <w:t xml:space="preserve"> </w:t>
+      </w:r>
+      <w:r>
+        <w:t xml:space="preserve">Nature Reviews Neuroscience, 11(2), 127–138.</w:t>
+      </w:r>
+    </w:p>
+    <w:p>
+      <w:pPr>
+        <w:pStyle w:val="Compact"/>
+        <w:numPr>
+          <w:ilvl w:val="0"/>
+          <w:numId w:val="1008"/>
+        </w:numPr>
+      </w:pPr>
+      <w:r>
+        <w:rPr>
+          <w:b/>
+          <w:bCs/>
+        </w:rPr>
+        <w:t xml:space="preserve">Friston, K., FitzGerald, T., Rigoli, F., Schwartenbeck, P., &amp; Pezzulo, G. (2017).</w:t>
+      </w:r>
+      <w:r>
+        <w:t xml:space="preserve"> </w:t>
+      </w:r>
+      <w:r>
+        <w:rPr>
+          <w:i/>
+          <w:iCs/>
+        </w:rPr>
+        <w:t xml:space="preserve">Active Inference: A Process Theory.</w:t>
+      </w:r>
+      <w:r>
+        <w:t xml:space="preserve"> </w:t>
+      </w:r>
+      <w:r>
+        <w:t xml:space="preserve">Neural Computation, 29(1), 1–49.</w:t>
+      </w:r>
+    </w:p>
+    <w:p>
+      <w:pPr>
+        <w:pStyle w:val="Compact"/>
+        <w:numPr>
+          <w:ilvl w:val="0"/>
+          <w:numId w:val="1008"/>
+        </w:numPr>
+      </w:pPr>
+      <w:r>
+        <w:rPr>
+          <w:b/>
+          <w:bCs/>
+        </w:rPr>
+        <w:t xml:space="preserve">Kastrup, B. (2018).</w:t>
+      </w:r>
+      <w:r>
+        <w:t xml:space="preserve"> </w:t>
+      </w:r>
+      <w:r>
+        <w:rPr>
+          <w:i/>
+          <w:iCs/>
+        </w:rPr>
+        <w:t xml:space="preserve">Making Sense of the Mind-Body Relation: Why Dual-Aspect Monism Cannot Evade Analytic Idealism.</w:t>
+      </w:r>
+      <w:r>
+        <w:t xml:space="preserve"> </w:t>
+      </w:r>
+      <w:r>
+        <w:t xml:space="preserve">Theoria et Historia Scientiarum, 15, 63–82.</w:t>
+      </w:r>
+    </w:p>
+    <w:p>
+      <w:pPr>
+        <w:pStyle w:val="Compact"/>
+        <w:numPr>
+          <w:ilvl w:val="0"/>
+          <w:numId w:val="1008"/>
+        </w:numPr>
+      </w:pPr>
+      <w:r>
+        <w:rPr>
+          <w:b/>
+          <w:bCs/>
+        </w:rPr>
+        <w:t xml:space="preserve">Kastrup, B. (2019).</w:t>
+      </w:r>
+      <w:r>
+        <w:t xml:space="preserve"> </w:t>
+      </w:r>
+      <w:r>
+        <w:rPr>
+          <w:i/>
+          <w:iCs/>
+        </w:rPr>
+        <w:t xml:space="preserve">The Idea of the World: A Multi-Disciplinary Argument for the Mental Nature of Reality.</w:t>
+      </w:r>
+      <w:r>
+        <w:t xml:space="preserve"> </w:t>
+      </w:r>
+      <w:r>
+        <w:t xml:space="preserve">Iff Books.</w:t>
+      </w:r>
+    </w:p>
+    <w:p>
+      <w:pPr>
+        <w:pStyle w:val="Compact"/>
+        <w:numPr>
+          <w:ilvl w:val="0"/>
+          <w:numId w:val="1008"/>
+        </w:numPr>
+      </w:pPr>
+      <w:r>
+        <w:rPr>
+          <w:b/>
+          <w:bCs/>
+        </w:rPr>
+        <w:t xml:space="preserve">Koch, C. (2019).</w:t>
+      </w:r>
+      <w:r>
+        <w:t xml:space="preserve"> </w:t>
+      </w:r>
+      <w:r>
+        <w:rPr>
+          <w:i/>
+          <w:iCs/>
+        </w:rPr>
+        <w:t xml:space="preserve">The Feeling of Life Itself: Why Consciousness Is Widespread but Can’t Be Computed.</w:t>
+      </w:r>
+      <w:r>
+        <w:t xml:space="preserve"> </w:t>
+      </w:r>
+      <w:r>
+        <w:t xml:space="preserve">MIT Press.</w:t>
+      </w:r>
+    </w:p>
+    <w:p>
+      <w:pPr>
+        <w:pStyle w:val="Compact"/>
+        <w:numPr>
+          <w:ilvl w:val="0"/>
+          <w:numId w:val="1008"/>
+        </w:numPr>
+      </w:pPr>
+      <w:r>
+        <w:rPr>
+          <w:b/>
+          <w:bCs/>
+        </w:rPr>
+        <w:t xml:space="preserve">Metzinger, T. (2003).</w:t>
+      </w:r>
+      <w:r>
+        <w:t xml:space="preserve"> </w:t>
+      </w:r>
+      <w:r>
+        <w:rPr>
+          <w:i/>
+          <w:iCs/>
+        </w:rPr>
+        <w:t xml:space="preserve">Being No One: The Self-Model Theory of Subjectivity.</w:t>
+      </w:r>
+      <w:r>
+        <w:t xml:space="preserve"> </w:t>
+      </w:r>
+      <w:r>
+        <w:t xml:space="preserve">MIT Press.</w:t>
+      </w:r>
+    </w:p>
+    <w:p>
+      <w:pPr>
+        <w:pStyle w:val="Compact"/>
+        <w:numPr>
+          <w:ilvl w:val="0"/>
+          <w:numId w:val="1008"/>
+        </w:numPr>
+      </w:pPr>
+      <w:r>
+        <w:rPr>
+          <w:b/>
+          <w:bCs/>
+        </w:rPr>
+        <w:t xml:space="preserve">Metzinger, T. (2024).</w:t>
+      </w:r>
+      <w:r>
+        <w:t xml:space="preserve"> </w:t>
+      </w:r>
+      <w:r>
+        <w:rPr>
+          <w:i/>
+          <w:iCs/>
+        </w:rPr>
+        <w:t xml:space="preserve">The Elephant and the Blind: The Experience of Pure Consciousness: Philosophy, Science, and 500+ Experiential Reports.</w:t>
+      </w:r>
+      <w:r>
+        <w:t xml:space="preserve"> </w:t>
+      </w:r>
+      <w:r>
+        <w:t xml:space="preserve">MIT Press.</w:t>
+      </w:r>
+    </w:p>
+    <w:p>
+      <w:pPr>
+        <w:pStyle w:val="Compact"/>
+        <w:numPr>
+          <w:ilvl w:val="0"/>
+          <w:numId w:val="1008"/>
+        </w:numPr>
+      </w:pPr>
+      <w:r>
+        <w:rPr>
+          <w:b/>
+          <w:bCs/>
+        </w:rPr>
+        <w:t xml:space="preserve">Oizumi, M., Amari, S. I., Yanagawa, T., Fujii, N., &amp; Tsuchiya, N. (2016).</w:t>
+      </w:r>
+      <w:r>
+        <w:t xml:space="preserve"> </w:t>
+      </w:r>
+      <w:r>
+        <w:rPr>
+          <w:i/>
+          <w:iCs/>
+        </w:rPr>
+        <w:t xml:space="preserve">Measuring Integrated Information from the Decoding Perspective.</w:t>
+      </w:r>
+      <w:r>
+        <w:t xml:space="preserve"> </w:t>
+      </w:r>
+      <w:r>
+        <w:t xml:space="preserve">PLoS Computational Biology, 12(1), e1004654.</w:t>
+      </w:r>
+    </w:p>
+    <w:p>
+      <w:pPr>
+        <w:pStyle w:val="Compact"/>
+        <w:numPr>
+          <w:ilvl w:val="0"/>
+          <w:numId w:val="1008"/>
+        </w:numPr>
+      </w:pPr>
+      <w:r>
+        <w:rPr>
+          <w:b/>
+          <w:bCs/>
+        </w:rPr>
+        <w:t xml:space="preserve">Riebl, T. (2026).</w:t>
+      </w:r>
+      <w:r>
+        <w:t xml:space="preserve"> </w:t>
+      </w:r>
+      <w:r>
+        <w:rPr>
+          <w:i/>
+          <w:iCs/>
+        </w:rPr>
+        <w:t xml:space="preserve">Expanding IIT 4.0’s Axiom 0: The 6th Axiom of Autopoietic Causal Persistence (Will to Exist).</w:t>
+      </w:r>
+      <w:r>
+        <w:t xml:space="preserve"> </w:t>
+      </w:r>
+      <w:r>
+        <w:t xml:space="preserve">Working Paper &amp; Formal Proposal, Luxembourg.</w:t>
+      </w:r>
+    </w:p>
+    <w:p>
+      <w:pPr>
+        <w:pStyle w:val="Compact"/>
+        <w:numPr>
+          <w:ilvl w:val="0"/>
+          <w:numId w:val="1008"/>
+        </w:numPr>
+      </w:pPr>
+      <w:r>
+        <w:rPr>
+          <w:b/>
+          <w:bCs/>
+        </w:rPr>
+        <w:t xml:space="preserve">Roth, G. (2003).</w:t>
+      </w:r>
+      <w:r>
+        <w:t xml:space="preserve"> </w:t>
+      </w:r>
+      <w:r>
+        <w:rPr>
+          <w:i/>
+          <w:iCs/>
+        </w:rPr>
+        <w:t xml:space="preserve">Aus Sicht des Gehirns.</w:t>
+      </w:r>
+      <w:r>
+        <w:t xml:space="preserve"> </w:t>
+      </w:r>
+      <w:r>
+        <w:t xml:space="preserve">Suhrkamp Verlag, Frankfurt am Main.</w:t>
+      </w:r>
+    </w:p>
+    <w:p>
+      <w:pPr>
+        <w:pStyle w:val="Compact"/>
+        <w:numPr>
+          <w:ilvl w:val="0"/>
+          <w:numId w:val="1008"/>
+        </w:numPr>
+      </w:pPr>
+      <w:r>
+        <w:rPr>
+          <w:b/>
+          <w:bCs/>
+        </w:rPr>
+        <w:t xml:space="preserve">Roth, G. (2021).</w:t>
+      </w:r>
+      <w:r>
+        <w:t xml:space="preserve"> </w:t>
+      </w:r>
+      <w:r>
+        <w:rPr>
+          <w:i/>
+          <w:iCs/>
+        </w:rPr>
+        <w:t xml:space="preserve">Wie das Gehirn die Seele macht: Emotionen, Bewusstsein, Unbewusstes.</w:t>
+      </w:r>
+      <w:r>
+        <w:t xml:space="preserve"> </w:t>
+      </w:r>
+      <w:r>
+        <w:t xml:space="preserve">Klett-Cotta, Stuttgart.</w:t>
+      </w:r>
+    </w:p>
+    <w:p>
+      <w:pPr>
+        <w:pStyle w:val="Compact"/>
+        <w:numPr>
+          <w:ilvl w:val="0"/>
+          <w:numId w:val="1008"/>
+        </w:numPr>
+      </w:pPr>
+      <w:r>
+        <w:rPr>
+          <w:b/>
+          <w:bCs/>
+        </w:rPr>
+        <w:t xml:space="preserve">Spinoza, B. (1677).</w:t>
+      </w:r>
+      <w:r>
+        <w:t xml:space="preserve"> </w:t>
+      </w:r>
+      <w:r>
+        <w:rPr>
+          <w:i/>
+          <w:iCs/>
+        </w:rPr>
+        <w:t xml:space="preserve">Ethica, ordine geometrico demonstrata.</w:t>
+      </w:r>
+      <w:r>
+        <w:t xml:space="preserve"> </w:t>
+      </w:r>
+      <w:r>
+        <w:t xml:space="preserve">Posthumous Publication (Proposition 6 &amp; 7:</w:t>
+      </w:r>
+      <w:r>
+        <w:t xml:space="preserve"> </w:t>
+      </w:r>
+      <w:r>
+        <w:rPr>
+          <w:i/>
+          <w:iCs/>
+        </w:rPr>
+        <w:t xml:space="preserve">Conatus</w:t>
+      </w:r>
+      <w:r>
+        <w:t xml:space="preserve"> </w:t>
+      </w:r>
+      <w:r>
+        <w:t xml:space="preserve">as the intrinsic endeavor of every entity to persist in its own being).</w:t>
+      </w:r>
+    </w:p>
+    <w:p>
+      <w:pPr>
+        <w:pStyle w:val="Compact"/>
+        <w:numPr>
+          <w:ilvl w:val="0"/>
+          <w:numId w:val="1008"/>
+        </w:numPr>
+      </w:pPr>
+      <w:r>
+        <w:rPr>
+          <w:b/>
+          <w:bCs/>
+        </w:rPr>
+        <w:t xml:space="preserve">Tononi, G., Boly, M., Massimini, M., &amp; Koch, C. (2016).</w:t>
+      </w:r>
+      <w:r>
+        <w:t xml:space="preserve"> </w:t>
+      </w:r>
+      <w:r>
+        <w:rPr>
+          <w:i/>
+          <w:iCs/>
+        </w:rPr>
+        <w:t xml:space="preserve">Integrated information theory: from consciousness to its physical substrate.</w:t>
+      </w:r>
+      <w:r>
+        <w:t xml:space="preserve"> </w:t>
+      </w:r>
+      <w:r>
+        <w:t xml:space="preserve">Nature Reviews Neuroscience, 17(7), 450–461.</w:t>
+      </w:r>
+    </w:p>
+    <w:p>
+      <w:r>
+        <w:pict>
+          <v:rect style="width:0;height:1.5pt" o:hralign="center" o:hrstd="t" o:hr="t"/>
+        </w:pict>
+      </w:r>
+    </w:p>
+    <w:bookmarkEnd w:id="42"/>
+    <w:bookmarkStart w:id="48" w:name="tool-attribution-colophon"/>
+    <w:p>
+      <w:pPr>
+        <w:pStyle w:val="Heading2"/>
+      </w:pPr>
+      <w:r>
+        <w:t xml:space="preserve">8. Tool Attribution &amp; Colophon</w:t>
+      </w:r>
+    </w:p>
+    <w:p>
+      <w:pPr>
+        <w:pStyle w:val="BlockText"/>
+      </w:pPr>
+      <w:r>
+        <w:t xml:space="preserve">[!NOTE]</w:t>
+      </w:r>
+      <w:r>
+        <w:t xml:space="preserve"> </w:t>
+      </w:r>
+      <w:r>
+        <w:rPr>
+          <w:b/>
+          <w:bCs/>
+        </w:rPr>
+        <w:t xml:space="preserve">Framework &amp; Tooling Colophon:</w:t>
+      </w:r>
+      <w:r>
+        <w:br/>
+      </w:r>
+      <w:r>
+        <w:t xml:space="preserve">This theoretical paper, mathematical synthesis, and computational Python simulation model were conceptualized and authored by</w:t>
+      </w:r>
+      <w:r>
+        <w:t xml:space="preserve"> </w:t>
+      </w:r>
+      <w:r>
+        <w:rPr>
+          <w:b/>
+          <w:bCs/>
+        </w:rPr>
+        <w:t xml:space="preserve">Thomas Riebl</w:t>
+      </w:r>
+      <w:r>
+        <w:t xml:space="preserve"> </w:t>
+      </w:r>
+      <w:r>
+        <w:t xml:space="preserve">(Luxembourg).</w:t>
+      </w:r>
+      <w:r>
+        <w:br/>
+      </w:r>
+      <w:r>
+        <w:t xml:space="preserve">The computational formulation, code implementation, vector diagram styling, and multi-format document compilation (Word</w:t>
+      </w:r>
+      <w:r>
+        <w:t xml:space="preserve"> </w:t>
+      </w:r>
+      <w:r>
+        <w:rPr>
+          <w:rStyle w:val="VerbatimChar"/>
+        </w:rPr>
+        <w:t xml:space="preserve">.docx</w:t>
+      </w:r>
+      <w:r>
+        <w:t xml:space="preserve">, Print-Ready PDF, and Jupyter Notebook) were developed in collaboration with</w:t>
+      </w:r>
+      <w:r>
+        <w:t xml:space="preserve"> </w:t>
+      </w:r>
+      <w:r>
+        <w:rPr>
+          <w:b/>
+          <w:bCs/>
+        </w:rPr>
+        <w:t xml:space="preserve">COG (Cognitive Organization Grid)</w:t>
+      </w:r>
+      <w:r>
+        <w:t xml:space="preserve"> </w:t>
+      </w:r>
+      <w:r>
+        <w:t xml:space="preserve">and</w:t>
+      </w:r>
+      <w:r>
+        <w:t xml:space="preserve"> </w:t>
+      </w:r>
+      <w:r>
+        <w:rPr>
+          <w:b/>
+          <w:bCs/>
+        </w:rPr>
+        <w:t xml:space="preserve">Google Gemini (Antigravity Advanced Agentic Coding System)</w:t>
+      </w:r>
+      <w:r>
+        <w:t xml:space="preserve"> </w:t>
+      </w:r>
+      <w:r>
+        <w:t xml:space="preserve">(August 2026).</w:t>
+      </w:r>
+    </w:p>
+    <w:p>
+      <w:r>
+        <w:pict>
+          <v:rect style="width:0;height:1.5pt" o:hralign="center" o:hrstd="t" o:hr="t"/>
+        </w:pict>
+      </w:r>
+    </w:p>
+    <w:bookmarkStart w:id="47" w:name="vault-repository-references"/>
+    <w:p>
+      <w:pPr>
+        <w:pStyle w:val="Heading3"/>
+      </w:pPr>
+      <w:r>
+        <w:t xml:space="preserve">Vault &amp; Repository References</w:t>
+      </w:r>
+    </w:p>
+    <w:p>
+      <w:pPr>
+        <w:pStyle w:val="Compact"/>
+        <w:numPr>
+          <w:ilvl w:val="0"/>
+          <w:numId w:val="1009"/>
+        </w:numPr>
+      </w:pPr>
+      <w:r>
+        <w:rPr>
+          <w:b/>
+          <w:bCs/>
+        </w:rPr>
         <w:t xml:space="preserve">GitHub Project Repository:</w:t>
       </w:r>
       <w:r>
         <w:t xml:space="preserve"> </w:t>
       </w:r>
-      <w:hyperlink r:id="rId40">
+      <w:hyperlink r:id="rId43">
         <w:r>
           <w:rPr>
             <w:rStyle w:val="VerbatimChar"/>
@@ -4134,7 +4936,7 @@
         <w:pStyle w:val="Compact"/>
         <w:numPr>
           <w:ilvl w:val="0"/>
-          <w:numId w:val="1007"/>
+          <w:numId w:val="1009"/>
         </w:numPr>
       </w:pPr>
       <w:r>
@@ -4147,7 +4949,7 @@
       <w:r>
         <w:t xml:space="preserve"> </w:t>
       </w:r>
-      <w:hyperlink r:id="rId41">
+      <w:hyperlink r:id="rId44">
         <w:r>
           <w:rPr>
             <w:rStyle w:val="VerbatimChar"/>
@@ -4161,7 +4963,7 @@
         <w:pStyle w:val="Compact"/>
         <w:numPr>
           <w:ilvl w:val="0"/>
-          <w:numId w:val="1007"/>
+          <w:numId w:val="1009"/>
         </w:numPr>
       </w:pPr>
       <w:r>
@@ -4174,7 +4976,7 @@
       <w:r>
         <w:t xml:space="preserve"> </w:t>
       </w:r>
-      <w:hyperlink r:id="rId42">
+      <w:hyperlink r:id="rId45">
         <w:r>
           <w:rPr>
             <w:rStyle w:val="VerbatimChar"/>
@@ -4188,7 +4990,7 @@
         <w:pStyle w:val="Compact"/>
         <w:numPr>
           <w:ilvl w:val="0"/>
-          <w:numId w:val="1007"/>
+          <w:numId w:val="1009"/>
         </w:numPr>
       </w:pPr>
       <w:r>
@@ -4201,7 +5003,7 @@
       <w:r>
         <w:t xml:space="preserve"> </w:t>
       </w:r>
-      <w:hyperlink r:id="rId43">
+      <w:hyperlink r:id="rId46">
         <w:r>
           <w:rPr>
             <w:rStyle w:val="VerbatimChar"/>
@@ -4210,9 +5012,9 @@
         </w:r>
       </w:hyperlink>
     </w:p>
-    <w:bookmarkEnd w:id="44"/>
-    <w:bookmarkEnd w:id="45"/>
-    <w:bookmarkEnd w:id="46"/>
+    <w:bookmarkEnd w:id="47"/>
+    <w:bookmarkEnd w:id="48"/>
+    <w:bookmarkEnd w:id="49"/>
     <w:sectPr>
       <w:footnotePr>
         <w:numRestart w:val="eachSect"/>
@@ -4518,34 +5320,7 @@
     <w:abstractNumId w:val="991"/>
   </w:num>
   <w:num w:numId="1002">
-    <w:abstractNumId w:val="99411"/>
-    <w:lvlOverride w:ilvl="0">
-      <w:startOverride w:val="1"/>
-    </w:lvlOverride>
-    <w:lvlOverride w:ilvl="1">
-      <w:startOverride w:val="1"/>
-    </w:lvlOverride>
-    <w:lvlOverride w:ilvl="2">
-      <w:startOverride w:val="1"/>
-    </w:lvlOverride>
-    <w:lvlOverride w:ilvl="3">
-      <w:startOverride w:val="1"/>
-    </w:lvlOverride>
-    <w:lvlOverride w:ilvl="4">
-      <w:startOverride w:val="1"/>
-    </w:lvlOverride>
-    <w:lvlOverride w:ilvl="5">
-      <w:startOverride w:val="1"/>
-    </w:lvlOverride>
-    <w:lvlOverride w:ilvl="6">
-      <w:startOverride w:val="1"/>
-    </w:lvlOverride>
-    <w:lvlOverride w:ilvl="7">
-      <w:startOverride w:val="1"/>
-    </w:lvlOverride>
-    <w:lvlOverride w:ilvl="8">
-      <w:startOverride w:val="1"/>
-    </w:lvlOverride>
+    <w:abstractNumId w:val="991"/>
   </w:num>
   <w:num w:numId="1003">
     <w:abstractNumId w:val="99411"/>
@@ -4638,9 +5413,69 @@
     </w:lvlOverride>
   </w:num>
   <w:num w:numId="1006">
+    <w:abstractNumId w:val="99411"/>
+    <w:lvlOverride w:ilvl="0">
+      <w:startOverride w:val="1"/>
+    </w:lvlOverride>
+    <w:lvlOverride w:ilvl="1">
+      <w:startOverride w:val="1"/>
+    </w:lvlOverride>
+    <w:lvlOverride w:ilvl="2">
+      <w:startOverride w:val="1"/>
+    </w:lvlOverride>
+    <w:lvlOverride w:ilvl="3">
+      <w:startOverride w:val="1"/>
+    </w:lvlOverride>
+    <w:lvlOverride w:ilvl="4">
+      <w:startOverride w:val="1"/>
+    </w:lvlOverride>
+    <w:lvlOverride w:ilvl="5">
+      <w:startOverride w:val="1"/>
+    </w:lvlOverride>
+    <w:lvlOverride w:ilvl="6">
+      <w:startOverride w:val="1"/>
+    </w:lvlOverride>
+    <w:lvlOverride w:ilvl="7">
+      <w:startOverride w:val="1"/>
+    </w:lvlOverride>
+    <w:lvlOverride w:ilvl="8">
+      <w:startOverride w:val="1"/>
+    </w:lvlOverride>
+  </w:num>
+  <w:num w:numId="1007">
     <w:abstractNumId w:val="991"/>
   </w:num>
-  <w:num w:numId="1007">
+  <w:num w:numId="1008">
+    <w:abstractNumId w:val="99411"/>
+    <w:lvlOverride w:ilvl="0">
+      <w:startOverride w:val="1"/>
+    </w:lvlOverride>
+    <w:lvlOverride w:ilvl="1">
+      <w:startOverride w:val="1"/>
+    </w:lvlOverride>
+    <w:lvlOverride w:ilvl="2">
+      <w:startOverride w:val="1"/>
+    </w:lvlOverride>
+    <w:lvlOverride w:ilvl="3">
+      <w:startOverride w:val="1"/>
+    </w:lvlOverride>
+    <w:lvlOverride w:ilvl="4">
+      <w:startOverride w:val="1"/>
+    </w:lvlOverride>
+    <w:lvlOverride w:ilvl="5">
+      <w:startOverride w:val="1"/>
+    </w:lvlOverride>
+    <w:lvlOverride w:ilvl="6">
+      <w:startOverride w:val="1"/>
+    </w:lvlOverride>
+    <w:lvlOverride w:ilvl="7">
+      <w:startOverride w:val="1"/>
+    </w:lvlOverride>
+    <w:lvlOverride w:ilvl="8">
+      <w:startOverride w:val="1"/>
+    </w:lvlOverride>
+  </w:num>
+  <w:num w:numId="1009">
     <w:abstractNumId w:val="991"/>
   </w:num>
 </w:numbering>

</xml_diff>

<commit_message>
Remove COG from Tool Attribution note in Master Paper
</commit_message>
<xml_diff>
--- a/docs/The_Computational_Grounding_of_My_Ontology_Thomas_Riebl.docx
+++ b/docs/The_Computational_Grounding_of_My_Ontology_Thomas_Riebl.docx
@@ -4813,7 +4813,7 @@
           <w:b/>
           <w:bCs/>
         </w:rPr>
-        <w:t xml:space="preserve">Framework &amp; Tooling Colophon:</w:t>
+        <w:t xml:space="preserve">Tooling Colophon:</w:t>
       </w:r>
       <w:r>
         <w:br/>
@@ -4853,23 +4853,7 @@
         <w:t xml:space="preserve">.docx</w:t>
       </w:r>
       <w:r>
-        <w:t xml:space="preserve">, Print-Ready PDF, and Jupyter Notebook) were developed in collaboration with</w:t>
-      </w:r>
-      <w:r>
-        <w:t xml:space="preserve"> </w:t>
-      </w:r>
-      <w:r>
-        <w:rPr>
-          <w:b/>
-          <w:bCs/>
-        </w:rPr>
-        <w:t xml:space="preserve">COG (Cognitive Organization Grid)</w:t>
-      </w:r>
-      <w:r>
-        <w:t xml:space="preserve"> </w:t>
-      </w:r>
-      <w:r>
-        <w:t xml:space="preserve">and</w:t>
+        <w:t xml:space="preserve">, Print-Ready PDF, and Jupyter Notebook) were developed with the assistance of</w:t>
       </w:r>
       <w:r>
         <w:t xml:space="preserve"> </w:t>

</xml_diff>